<commit_message>
Reword to reduce 'meaning'
</commit_message>
<xml_diff>
--- a/IST3134_Report_update.docx
+++ b/IST3134_Report_update.docx
@@ -1096,7 +1096,7 @@
         <w:rPr>
           <w:color w:val="000000" w:themeColor="text1"/>
         </w:rPr>
-        <w:t xml:space="preserve">For our analysis we used a focused set of the columns rather than all 110, meaning we kept the airline, the origin and destination airports, the scheduled departure time, the arrival delay, the cancellation flag and the five delay cause columns. Throughout this report a flight is counted as </w:t>
+        <w:t xml:space="preserve">For our analysis we used a focused set of the columns rather than all 110, keeping the airline, the origin and destination airports, the scheduled departure time, the arrival delay, the cancellation flag and the five delay cause columns. Throughout this report a flight is counted as </w:t>
       </w:r>
       <w:r>
         <w:rPr>
@@ -2008,7 +2008,7 @@
         <w:rPr>
           <w:color w:val="000000" w:themeColor="text1"/>
         </w:rPr>
-        <w:t>Behind the scenes, Spark breaks the work into three stages. In the map stage each flight record is read once and turned into a key and a small set of values, for example the key is the airline and the values are a count of one, the arrival delay in minutes and a 1 or 0 flag for whether the flight was delayed. In the shuffle stage the platform gathers together all the values that share the same key, meaning all the records for the same airline are brought to the same place. In the reduce stage the values in each group are combined, meaning the counts are added up, the delay minutes are averaged and the delayed flags are averaged to give the percentage of delayed flights. The same three stage pattern is used for the airport, route, hour and yearly cause groupings, only the key changes.</w:t>
+        <w:t>Behind the scenes, Spark breaks the work into three stages. In the map stage each flight record is read once and turned into a key and a small set of values, for example the key is the airline and the values are a count of one, the arrival delay in minutes and a 1 or 0 flag for whether the flight was delayed. In the shuffle stage the platform gathers together all the values that share the same key, so all the records for the same airline are brought to the same place. In the reduce stage the values in each group are combined, so the counts are added up, the delay minutes are averaged and the delayed flags are averaged to give the percentage of delayed flights. The same three stage pattern is used for the airport, route, hour and yearly cause groupings, only the key changes.</w:t>
       </w:r>
     </w:p>
     <w:p>
@@ -2037,7 +2037,7 @@
         <w:rPr>
           <w:color w:val="000000" w:themeColor="text1"/>
         </w:rPr>
-        <w:t xml:space="preserve"> the entire dataset into the memory of one machine and then processes it, so the memory needed grows with the size of the data. Spark instead splits the data into many partitions, meaning smaller chunks and spreads them across the machines in a cluster so that many parts of the map and reduce work happen at the same time. When memory runs low Spark writes intermediate data to disk (this is called spilling) instead of failing, so it can process data that is far larger than the memory of any single machine (The pandas development team, n.d.-b; Zaharia, Chowdhury, Franklin, Shenker, &amp; Stoica, 2010). This is why the same algorithm scales to the full decade on Spark while it strains the single machine version and it is the central point that this assignment is designed to demonstrate.</w:t>
+        <w:t xml:space="preserve"> the entire dataset into the memory of one machine and then processes it, so the memory needed grows with the size of the data. Spark instead splits the data into many smaller partitions and spreads them across the machines in a cluster so that many parts of the map and reduce work happen at the same time. When memory runs low Spark writes intermediate data to disk (this is called spilling) instead of failing, so it can process data that is far larger than the memory of any single machine (The pandas development team, n.d.-b; Zaharia, Chowdhury, Franklin, Shenker, &amp; Stoica, 2010). This is why the same algorithm scales to the full decade on Spark while it strains the single machine version and it is the central point that this assignment is designed to demonstrate.</w:t>
       </w:r>
     </w:p>
     <w:p>
@@ -2201,45 +2201,39 @@
         <w:rPr>
           <w:color w:val="000000" w:themeColor="text1"/>
         </w:rPr>
-        <w:t xml:space="preserve">The Big Data version was written in </w:t>
+        <w:t xml:space="preserve">The Big Data version was written in PySpark, which is the Python interface to Apache Spark and it was run on a cluster on Amazon Web Services. We uploaded the data to Amazon S3 for cloud storage and we then created an Amazon EMR cluster, which is a managed Spark and Hadoop platform, made up of one primary node and two core nodes. </w:t>
       </w:r>
       <w:proofErr w:type="spellStart"/>
       <w:r>
         <w:rPr>
           <w:color w:val="000000" w:themeColor="text1"/>
         </w:rPr>
-        <w:t>PySpark</w:t>
       </w:r>
       <w:proofErr w:type="spellEnd"/>
       <w:r>
         <w:rPr>
           <w:color w:val="000000" w:themeColor="text1"/>
         </w:rPr>
-        <w:t>, which is the Python interface to Apache Spark</w:t>
-      </w:r>
-      <w:r>
-        <w:rPr>
-          <w:color w:val="000000" w:themeColor="text1"/>
-        </w:rPr>
-        <w:t xml:space="preserve"> and </w:t>
-      </w:r>
-      <w:r>
-        <w:rPr>
-          <w:color w:val="000000" w:themeColor="text1"/>
-        </w:rPr>
-        <w:t>it was run on a cluster on Amazon Web Services. We uploaded the data to Amazon S3, meaning cloud storage</w:t>
-      </w:r>
-      <w:r>
-        <w:rPr>
-          <w:color w:val="000000" w:themeColor="text1"/>
-        </w:rPr>
-        <w:t xml:space="preserve"> and </w:t>
-      </w:r>
-      <w:r>
-        <w:rPr>
-          <w:color w:val="000000" w:themeColor="text1"/>
-        </w:rPr>
-        <w:t xml:space="preserve">we then created an Amazon EMR cluster, which is a managed Spark and Hadoop platform, made up of one primary node and two core nodes. </w:t>
+      </w:r>
+      <w:r>
+        <w:rPr>
+          <w:color w:val="000000" w:themeColor="text1"/>
+        </w:rPr>
+      </w:r>
+      <w:r>
+        <w:rPr>
+          <w:color w:val="000000" w:themeColor="text1"/>
+        </w:rPr>
+      </w:r>
+      <w:r>
+        <w:rPr>
+          <w:color w:val="000000" w:themeColor="text1"/>
+        </w:rPr>
+      </w:r>
+      <w:r>
+        <w:rPr>
+          <w:color w:val="000000" w:themeColor="text1"/>
+        </w:rPr>
       </w:r>
     </w:p>
     <w:p>
@@ -2319,7 +2313,7 @@
         <w:rPr>
           <w:color w:val="000000" w:themeColor="text1"/>
         </w:rPr>
-        <w:t xml:space="preserve">they did, meaning the result tables from pandas and from Spark matched to the decimal, for example American Airlines showed the same 29.29% of flights delayed for January 2024 in both. </w:t>
+        <w:t xml:space="preserve">they did, the result tables from pandas and from Spark matched to the decimal, for example American Airlines showed the same 29.29% of flights delayed for January 2024 in both. </w:t>
       </w:r>
       <w:r>
         <w:rPr>
@@ -6022,7 +6016,7 @@
         <w:rPr>
           <w:color w:val="000000" w:themeColor="text1"/>
         </w:rPr>
-        <w:t xml:space="preserve">The results above answer the flight delay question and they are the same no matter which tool produced them. The purpose of this section is different, meaning it compares how the two implementations behaved as the data grew, which is the core Big Data argument of the assignment. Table 6 lists the measured runtime for both approaches and the peak memory for the </w:t>
+        <w:t xml:space="preserve">The results above answer the flight delay question and they are the same no matter which tool produced them. The purpose of this section is different, it compares how the two implementations behaved as the data grew, which is the core Big Data argument of the assignment. Table 6 lists the measured runtime for both approaches and the peak memory for the </w:t>
       </w:r>
       <w:proofErr w:type="gramStart"/>
       <w:r>
@@ -6997,7 +6991,7 @@
       </w:r>
       <w:proofErr w:type="gramEnd"/>
       <w:r>
-        <w:t xml:space="preserve"> because it runs in a single process on data that is already local, so it starts computing straight away, while Spark must first launch a cluster of Java processes, pull the compressed files across the network from S3 and split them into partitions, and that fixed setup of tens of seconds dwarfs the tiny amount of real work. As the data grows the picture inverts, because pandas does all the work sequentially on one core so its time rises in a roughly straight line with the number of rows, whereas Spark spreads the same work across many cores and nodes so its per-row cost is lower and its fixed startup becomes a smaller and smaller fraction of the total, which is why the gap widens rather than staying constant. The practical meaning is that the crossover point, near one year or about seven million rows for us, acts as a rough decision threshold for when a distributed tool is worth its overhead, though the exact point would shift with cluster size, file format and network speed, so it should be read as indicative rather than a fixed rule.</w:t>
+        <w:t xml:space="preserve"> because it runs in a single process on data that is already local, so it starts computing straight away, while Spark must first launch a cluster of Java processes, pull the compressed files across the network from S3 and split them into partitions, and that fixed setup of tens of seconds dwarfs the tiny amount of real work. As the data grows the picture inverts, because pandas does all the work sequentially on one core so its time rises in a roughly straight line with the number of rows, whereas Spark spreads the same work across many cores and nodes so its per-row cost is lower and its fixed startup becomes a smaller and smaller fraction of the total, which is why the gap widens rather than staying constant. The practical takeaway is that the crossover point, near one year or about seven million rows for us, acts as a rough decision threshold for when a distributed tool is worth its overhead, though the exact point would shift with cluster size, file format and network speed, so it should be read as indicative rather than a fixed rule.</w:t>
       </w:r>
     </w:p>
     <w:p>

</xml_diff>